<commit_message>
Update Kemas Muhammad Ridhuan.docx
</commit_message>
<xml_diff>
--- a/Hasil Wawancara/Kemas Muhammad Ridhuan.docx
+++ b/Hasil Wawancara/Kemas Muhammad Ridhuan.docx
@@ -4,7 +4,7 @@
   <w:body>
     <w:tbl>
       <w:tblPr>
-        <w:tblStyle w:val="TableGrid"/>
+        <w:tblStyle w:val="KisiTabel"/>
         <w:tblW w:w="8153" w:type="dxa"/>
         <w:jc w:val="center"/>
         <w:tblLayout w:type="fixed"/>
@@ -1170,39 +1170,7 @@
                 <w:sz w:val="16"/>
                 <w:szCs w:val="16"/>
               </w:rPr>
-              <w:t xml:space="preserve">Kegagalan panen, dan krisis ekonomi dalam sektor pertanian disebabkan oleh rendahnya hasil produksi tanaman pangan dan sayuran. Dampak jangka panjang dari fenomena El </w:t>
-            </w:r>
-            <w:r>
-              <w:rPr>
-                <w:rFonts w:ascii="Arial" w:hAnsi="Arial" w:cs="Arial"/>
-                <w:sz w:val="16"/>
-                <w:szCs w:val="16"/>
-              </w:rPr>
-              <w:t>Nino</w:t>
-            </w:r>
-            <w:r>
-              <w:rPr>
-                <w:rFonts w:ascii="Arial" w:hAnsi="Arial" w:cs="Arial"/>
-                <w:sz w:val="16"/>
-                <w:szCs w:val="16"/>
-              </w:rPr>
-              <w:t xml:space="preserve"> mengakibatkan </w:t>
-            </w:r>
-            <w:r>
-              <w:rPr>
-                <w:rFonts w:ascii="Arial" w:hAnsi="Arial" w:cs="Arial"/>
-                <w:sz w:val="16"/>
-                <w:szCs w:val="16"/>
-              </w:rPr>
-              <w:t>pemantauan</w:t>
-            </w:r>
-            <w:r>
-              <w:rPr>
-                <w:rFonts w:ascii="Arial" w:hAnsi="Arial" w:cs="Arial"/>
-                <w:sz w:val="16"/>
-                <w:szCs w:val="16"/>
-              </w:rPr>
-              <w:t xml:space="preserve"> dan pengawasan yang tidak optimal. Metode ini berpengaruh pada efisiensi waktu dan tenaga yang kurang, sehingga jadwal yang ditetapkan menjadi tidak sesuai.</w:t>
+              <w:t>Kegagalan panen, dan krisis ekonomi dalam sektor pertanian disebabkan oleh rendahnya hasil produksi tanaman pangan dan sayuran. Dampak jangka panjang dari fenomena El Nino mengakibatkan pemantauan dan pengawasan yang tidak optimal. Metode ini berpengaruh pada efisiensi waktu dan tenaga yang kurang, sehingga jadwal yang ditetapkan menjadi tidak sesuai.</w:t>
             </w:r>
           </w:p>
         </w:tc>
@@ -1967,6 +1935,87 @@
     <w:p>
       <w:pPr>
         <w:rPr>
+          <w:rFonts w:ascii="Arial" w:hAnsi="Arial" w:cs="Arial"/>
+          <w:lang w:val="en-US"/>
+        </w:rPr>
+      </w:pPr>
+    </w:p>
+    <w:p>
+      <w:pPr>
+        <w:rPr>
+          <w:rFonts w:ascii="Arial" w:hAnsi="Arial" w:cs="Arial"/>
+          <w:lang w:val="en-US"/>
+        </w:rPr>
+      </w:pPr>
+    </w:p>
+    <w:p>
+      <w:pPr>
+        <w:rPr>
+          <w:rFonts w:ascii="Arial" w:hAnsi="Arial" w:cs="Arial"/>
+          <w:lang w:val="en-US"/>
+        </w:rPr>
+      </w:pPr>
+    </w:p>
+    <w:p>
+      <w:pPr>
+        <w:rPr>
+          <w:rFonts w:ascii="Arial" w:hAnsi="Arial" w:cs="Arial"/>
+          <w:lang w:val="en-US"/>
+        </w:rPr>
+      </w:pPr>
+    </w:p>
+    <w:p>
+      <w:pPr>
+        <w:rPr>
+          <w:rFonts w:ascii="Arial" w:hAnsi="Arial" w:cs="Arial"/>
+          <w:lang w:val="en-US"/>
+        </w:rPr>
+      </w:pPr>
+    </w:p>
+    <w:p>
+      <w:pPr>
+        <w:rPr>
+          <w:rFonts w:ascii="Arial" w:hAnsi="Arial" w:cs="Arial"/>
+          <w:lang w:val="en-US"/>
+        </w:rPr>
+      </w:pPr>
+    </w:p>
+    <w:p>
+      <w:pPr>
+        <w:rPr>
+          <w:rFonts w:ascii="Arial" w:hAnsi="Arial" w:cs="Arial"/>
+          <w:lang w:val="en-US"/>
+        </w:rPr>
+      </w:pPr>
+    </w:p>
+    <w:p>
+      <w:pPr>
+        <w:rPr>
+          <w:rFonts w:ascii="Arial" w:hAnsi="Arial" w:cs="Arial"/>
+          <w:lang w:val="en-US"/>
+        </w:rPr>
+      </w:pPr>
+    </w:p>
+    <w:p>
+      <w:pPr>
+        <w:rPr>
+          <w:rFonts w:ascii="Arial" w:hAnsi="Arial" w:cs="Arial"/>
+          <w:lang w:val="en-US"/>
+        </w:rPr>
+      </w:pPr>
+    </w:p>
+    <w:p>
+      <w:pPr>
+        <w:rPr>
+          <w:rFonts w:ascii="Arial" w:hAnsi="Arial" w:cs="Arial"/>
+          <w:lang w:val="en-US"/>
+        </w:rPr>
+      </w:pPr>
+    </w:p>
+    <w:p>
+      <w:pPr>
+        <w:rPr>
+          <w:rFonts w:ascii="Arial" w:hAnsi="Arial" w:cs="Arial"/>
           <w:lang w:val="en-US"/>
         </w:rPr>
       </w:pPr>
@@ -1990,6 +2039,9 @@
         <w:gridCol w:w="4106"/>
       </w:tblGrid>
       <w:tr>
+        <w:trPr>
+          <w:trHeight w:val="555"/>
+        </w:trPr>
         <w:tc>
           <w:tcPr>
             <w:tcW w:w="4106" w:type="dxa"/>
@@ -2001,11 +2053,13 @@
               <w:spacing w:after="0"/>
               <w:jc w:val="center"/>
               <w:rPr>
+                <w:rFonts w:ascii="Arial" w:hAnsi="Arial" w:cs="Arial"/>
                 <w:b/>
               </w:rPr>
             </w:pPr>
             <w:r>
               <w:rPr>
+                <w:rFonts w:ascii="Arial" w:hAnsi="Arial" w:cs="Arial"/>
                 <w:b/>
               </w:rPr>
               <w:t>Mahasiswa</w:t>
@@ -2023,11 +2077,13 @@
               <w:spacing w:after="0"/>
               <w:jc w:val="center"/>
               <w:rPr>
+                <w:rFonts w:ascii="Arial" w:hAnsi="Arial" w:cs="Arial"/>
                 <w:b/>
               </w:rPr>
             </w:pPr>
             <w:r>
               <w:rPr>
+                <w:rFonts w:ascii="Arial" w:hAnsi="Arial" w:cs="Arial"/>
                 <w:b/>
               </w:rPr>
               <w:t>Narasumber</w:t>
@@ -2046,34 +2102,55 @@
           <w:p>
             <w:pPr>
               <w:spacing w:line="276" w:lineRule="auto"/>
+              <w:rPr>
+                <w:rFonts w:ascii="Arial" w:hAnsi="Arial" w:cs="Arial"/>
+              </w:rPr>
             </w:pPr>
           </w:p>
           <w:p>
             <w:pPr>
               <w:spacing w:line="276" w:lineRule="auto"/>
+              <w:rPr>
+                <w:rFonts w:ascii="Arial" w:hAnsi="Arial" w:cs="Arial"/>
+              </w:rPr>
             </w:pPr>
           </w:p>
           <w:p>
             <w:pPr>
               <w:spacing w:line="276" w:lineRule="auto"/>
               <w:jc w:val="center"/>
+              <w:rPr>
+                <w:rFonts w:ascii="Arial" w:hAnsi="Arial" w:cs="Arial"/>
+              </w:rPr>
             </w:pPr>
           </w:p>
           <w:p>
             <w:pPr>
               <w:spacing w:line="276" w:lineRule="auto"/>
               <w:jc w:val="center"/>
+              <w:rPr>
+                <w:rFonts w:ascii="Arial" w:hAnsi="Arial" w:cs="Arial"/>
+              </w:rPr>
             </w:pPr>
           </w:p>
           <w:p>
             <w:pPr>
               <w:spacing w:line="276" w:lineRule="auto"/>
               <w:jc w:val="center"/>
-            </w:pPr>
-            <w:r>
+              <w:rPr>
+                <w:rFonts w:ascii="Arial" w:hAnsi="Arial" w:cs="Arial"/>
+              </w:rPr>
+            </w:pPr>
+            <w:r>
+              <w:rPr>
+                <w:rFonts w:ascii="Arial" w:hAnsi="Arial" w:cs="Arial"/>
+              </w:rPr>
               <w:t>_____________________</w:t>
             </w:r>
             <w:r>
+              <w:rPr>
+                <w:rFonts w:ascii="Arial" w:hAnsi="Arial" w:cs="Arial"/>
+              </w:rPr>
               <w:br/>
               <w:t>Kevin Pratama</w:t>
             </w:r>
@@ -2086,31 +2163,49 @@
           <w:p>
             <w:pPr>
               <w:spacing w:line="276" w:lineRule="auto"/>
+              <w:rPr>
+                <w:rFonts w:ascii="Arial" w:hAnsi="Arial" w:cs="Arial"/>
+              </w:rPr>
             </w:pPr>
           </w:p>
           <w:p>
             <w:pPr>
               <w:spacing w:line="276" w:lineRule="auto"/>
+              <w:rPr>
+                <w:rFonts w:ascii="Arial" w:hAnsi="Arial" w:cs="Arial"/>
+              </w:rPr>
             </w:pPr>
           </w:p>
           <w:p>
             <w:pPr>
               <w:spacing w:line="276" w:lineRule="auto"/>
               <w:jc w:val="center"/>
+              <w:rPr>
+                <w:rFonts w:ascii="Arial" w:hAnsi="Arial" w:cs="Arial"/>
+              </w:rPr>
             </w:pPr>
           </w:p>
           <w:p>
             <w:pPr>
               <w:spacing w:line="276" w:lineRule="auto"/>
               <w:jc w:val="center"/>
+              <w:rPr>
+                <w:rFonts w:ascii="Arial" w:hAnsi="Arial" w:cs="Arial"/>
+              </w:rPr>
             </w:pPr>
           </w:p>
           <w:p>
             <w:pPr>
               <w:spacing w:after="0" w:line="276" w:lineRule="auto"/>
               <w:jc w:val="center"/>
-            </w:pPr>
-            <w:r>
+              <w:rPr>
+                <w:rFonts w:ascii="Arial" w:hAnsi="Arial" w:cs="Arial"/>
+              </w:rPr>
+            </w:pPr>
+            <w:r>
+              <w:rPr>
+                <w:rFonts w:ascii="Arial" w:hAnsi="Arial" w:cs="Arial"/>
+              </w:rPr>
               <w:t>_____________________</w:t>
             </w:r>
           </w:p>
@@ -2118,14 +2213,172 @@
             <w:pPr>
               <w:spacing w:line="276" w:lineRule="auto"/>
               <w:jc w:val="center"/>
-            </w:pPr>
-            <w:r>
-              <w:rPr>
-                <w:rFonts w:ascii="Arial" w:hAnsi="Arial" w:cs="Arial"/>
-                <w:sz w:val="20"/>
-                <w:szCs w:val="20"/>
-              </w:rPr>
-              <w:t>Syamsul Bahri</w:t>
+              <w:rPr>
+                <w:rFonts w:ascii="Arial" w:hAnsi="Arial" w:cs="Arial"/>
+              </w:rPr>
+            </w:pPr>
+            <w:r>
+              <w:rPr>
+                <w:rFonts w:ascii="Arial" w:hAnsi="Arial" w:cs="Arial"/>
+                <w:sz w:val="20"/>
+                <w:szCs w:val="20"/>
+              </w:rPr>
+              <w:t>Kemas Muhammad Ridhuan</w:t>
+            </w:r>
+          </w:p>
+        </w:tc>
+      </w:tr>
+      <w:tr>
+        <w:trPr>
+          <w:trHeight w:val="1402"/>
+        </w:trPr>
+        <w:tc>
+          <w:tcPr>
+            <w:tcW w:w="8212" w:type="dxa"/>
+            <w:gridSpan w:val="2"/>
+            <w:shd w:val="clear" w:color="auto" w:fill="F2F2F2" w:themeFill="background1" w:themeFillShade="F2"/>
+            <w:vAlign w:val="center"/>
+          </w:tcPr>
+          <w:p>
+            <w:pPr>
+              <w:spacing w:after="0" w:line="276" w:lineRule="auto"/>
+              <w:jc w:val="center"/>
+              <w:rPr>
+                <w:rFonts w:ascii="Arial" w:hAnsi="Arial" w:cs="Arial"/>
+                <w:b/>
+              </w:rPr>
+            </w:pPr>
+            <w:r>
+              <w:rPr>
+                <w:rFonts w:ascii="Arial" w:hAnsi="Arial" w:cs="Arial"/>
+                <w:b/>
+              </w:rPr>
+              <w:t xml:space="preserve">Kepala </w:t>
+            </w:r>
+          </w:p>
+          <w:p>
+            <w:pPr>
+              <w:spacing w:after="0" w:line="276" w:lineRule="auto"/>
+              <w:jc w:val="center"/>
+              <w:rPr>
+                <w:rFonts w:ascii="Arial" w:hAnsi="Arial" w:cs="Arial"/>
+                <w:b/>
+              </w:rPr>
+            </w:pPr>
+            <w:r>
+              <w:rPr>
+                <w:rFonts w:ascii="Arial" w:hAnsi="Arial" w:cs="Arial"/>
+                <w:b/>
+              </w:rPr>
+              <w:t>UPTD Balai Pengembangan Dan Produksi Benih</w:t>
+            </w:r>
+          </w:p>
+          <w:p>
+            <w:pPr>
+              <w:spacing w:after="0" w:line="276" w:lineRule="auto"/>
+              <w:jc w:val="center"/>
+              <w:rPr>
+                <w:rFonts w:ascii="Arial" w:hAnsi="Arial" w:cs="Arial"/>
+                <w:b/>
+              </w:rPr>
+            </w:pPr>
+            <w:r>
+              <w:rPr>
+                <w:rFonts w:ascii="Arial" w:hAnsi="Arial" w:cs="Arial"/>
+                <w:b/>
+              </w:rPr>
+              <w:t>Tanaman Pangan Dan Hortikultura</w:t>
+            </w:r>
+          </w:p>
+          <w:p>
+            <w:pPr>
+              <w:spacing w:after="0" w:line="276" w:lineRule="auto"/>
+              <w:jc w:val="center"/>
+              <w:rPr>
+                <w:rFonts w:ascii="Arial" w:hAnsi="Arial" w:cs="Arial"/>
+              </w:rPr>
+            </w:pPr>
+            <w:r>
+              <w:rPr>
+                <w:rFonts w:ascii="Arial" w:hAnsi="Arial" w:cs="Arial"/>
+                <w:b/>
+              </w:rPr>
+              <w:t>Provinsi Sumatera Selatan</w:t>
+            </w:r>
+          </w:p>
+        </w:tc>
+      </w:tr>
+      <w:tr>
+        <w:trPr>
+          <w:trHeight w:val="1919"/>
+        </w:trPr>
+        <w:tc>
+          <w:tcPr>
+            <w:tcW w:w="8212" w:type="dxa"/>
+            <w:gridSpan w:val="2"/>
+          </w:tcPr>
+          <w:p>
+            <w:pPr>
+              <w:spacing w:line="276" w:lineRule="auto"/>
+              <w:rPr>
+                <w:rFonts w:ascii="Arial" w:hAnsi="Arial" w:cs="Arial"/>
+              </w:rPr>
+            </w:pPr>
+          </w:p>
+          <w:p>
+            <w:pPr>
+              <w:spacing w:line="276" w:lineRule="auto"/>
+              <w:jc w:val="center"/>
+              <w:rPr>
+                <w:rFonts w:ascii="Arial" w:hAnsi="Arial" w:cs="Arial"/>
+              </w:rPr>
+            </w:pPr>
+          </w:p>
+          <w:p>
+            <w:pPr>
+              <w:spacing w:line="276" w:lineRule="auto"/>
+              <w:jc w:val="center"/>
+              <w:rPr>
+                <w:rFonts w:ascii="Arial" w:hAnsi="Arial" w:cs="Arial"/>
+              </w:rPr>
+            </w:pPr>
+          </w:p>
+          <w:p>
+            <w:pPr>
+              <w:spacing w:after="0" w:line="276" w:lineRule="auto"/>
+              <w:jc w:val="center"/>
+              <w:rPr>
+                <w:rFonts w:ascii="Arial" w:hAnsi="Arial" w:cs="Arial"/>
+              </w:rPr>
+            </w:pPr>
+            <w:r>
+              <w:rPr>
+                <w:rFonts w:ascii="Arial" w:hAnsi="Arial" w:cs="Arial"/>
+              </w:rPr>
+              <w:t>________</w:t>
+            </w:r>
+            <w:r>
+              <w:rPr>
+                <w:rFonts w:ascii="Arial" w:hAnsi="Arial" w:cs="Arial"/>
+              </w:rPr>
+              <w:t>_____________________</w:t>
+            </w:r>
+          </w:p>
+          <w:p>
+            <w:pPr>
+              <w:spacing w:line="276" w:lineRule="auto"/>
+              <w:jc w:val="center"/>
+              <w:rPr>
+                <w:rFonts w:ascii="Arial" w:hAnsi="Arial" w:cs="Arial"/>
+              </w:rPr>
+            </w:pPr>
+            <w:r>
+              <w:rPr>
+                <w:rFonts w:ascii="Arial" w:hAnsi="Arial" w:cs="Arial"/>
+                <w:sz w:val="20"/>
+                <w:szCs w:val="20"/>
+              </w:rPr>
+              <w:t>Nur Wahyudiono, SP</w:t>
             </w:r>
           </w:p>
         </w:tc>
@@ -2134,11 +2387,15 @@
     <w:p>
       <w:pPr>
         <w:spacing w:after="0" w:line="240" w:lineRule="auto"/>
+        <w:rPr>
+          <w:rFonts w:ascii="Arial" w:hAnsi="Arial" w:cs="Arial"/>
+        </w:rPr>
       </w:pPr>
     </w:p>
     <w:p>
       <w:pPr>
         <w:rPr>
+          <w:rFonts w:ascii="Arial" w:hAnsi="Arial" w:cs="Arial"/>
           <w:lang w:val="en-US"/>
         </w:rPr>
       </w:pPr>
@@ -2642,12 +2899,13 @@
       <w:lang w:val="id-ID"/>
     </w:rPr>
   </w:style>
-  <w:style w:type="character" w:default="1" w:styleId="DefaultParagraphFont">
+  <w:style w:type="character" w:default="1" w:styleId="FontParagrafDefault">
     <w:name w:val="Default Paragraph Font"/>
     <w:uiPriority w:val="1"/>
+    <w:semiHidden/>
     <w:unhideWhenUsed/>
   </w:style>
-  <w:style w:type="table" w:default="1" w:styleId="TableNormal">
+  <w:style w:type="table" w:default="1" w:styleId="TabelNormal">
     <w:name w:val="Normal Table"/>
     <w:uiPriority w:val="99"/>
     <w:semiHidden/>
@@ -2662,7 +2920,7 @@
       </w:tblCellMar>
     </w:tblPr>
   </w:style>
-  <w:style w:type="numbering" w:default="1" w:styleId="NoList">
+  <w:style w:type="numbering" w:default="1" w:styleId="TidakAdaDaftar">
     <w:name w:val="No List"/>
     <w:uiPriority w:val="99"/>
     <w:semiHidden/>
@@ -2671,7 +2929,7 @@
   <w:style w:type="paragraph" w:styleId="Header">
     <w:name w:val="header"/>
     <w:basedOn w:val="Normal"/>
-    <w:link w:val="HeaderChar"/>
+    <w:link w:val="HeaderKAR"/>
     <w:uiPriority w:val="99"/>
     <w:unhideWhenUsed/>
     <w:rsid w:val="00033AA3"/>
@@ -2683,9 +2941,9 @@
       <w:spacing w:after="0" w:line="240" w:lineRule="auto"/>
     </w:pPr>
   </w:style>
-  <w:style w:type="character" w:customStyle="1" w:styleId="HeaderChar">
-    <w:name w:val="Header Char"/>
-    <w:basedOn w:val="DefaultParagraphFont"/>
+  <w:style w:type="character" w:customStyle="1" w:styleId="HeaderKAR">
+    <w:name w:val="Header KAR"/>
+    <w:basedOn w:val="FontParagrafDefault"/>
     <w:link w:val="Header"/>
     <w:uiPriority w:val="99"/>
     <w:rsid w:val="00033AA3"/>
@@ -2696,7 +2954,7 @@
   <w:style w:type="paragraph" w:styleId="Footer">
     <w:name w:val="footer"/>
     <w:basedOn w:val="Normal"/>
-    <w:link w:val="FooterChar"/>
+    <w:link w:val="FooterKAR"/>
     <w:uiPriority w:val="99"/>
     <w:unhideWhenUsed/>
     <w:rsid w:val="00033AA3"/>
@@ -2708,9 +2966,9 @@
       <w:spacing w:after="0" w:line="240" w:lineRule="auto"/>
     </w:pPr>
   </w:style>
-  <w:style w:type="character" w:customStyle="1" w:styleId="FooterChar">
-    <w:name w:val="Footer Char"/>
-    <w:basedOn w:val="DefaultParagraphFont"/>
+  <w:style w:type="character" w:customStyle="1" w:styleId="FooterKAR">
+    <w:name w:val="Footer KAR"/>
+    <w:basedOn w:val="FontParagrafDefault"/>
     <w:link w:val="Footer"/>
     <w:uiPriority w:val="99"/>
     <w:rsid w:val="00033AA3"/>
@@ -2718,9 +2976,9 @@
       <w:lang w:val="id-ID"/>
     </w:rPr>
   </w:style>
-  <w:style w:type="table" w:styleId="TableGrid">
+  <w:style w:type="table" w:styleId="KisiTabel">
     <w:name w:val="Table Grid"/>
-    <w:basedOn w:val="TableNormal"/>
+    <w:basedOn w:val="TabelNormal"/>
     <w:uiPriority w:val="39"/>
     <w:rsid w:val="00033AA3"/>
     <w:pPr>
@@ -2737,7 +2995,7 @@
       </w:tblBorders>
     </w:tblPr>
   </w:style>
-  <w:style w:type="paragraph" w:styleId="ListParagraph">
+  <w:style w:type="paragraph" w:styleId="DaftarParagraf">
     <w:name w:val="List Paragraph"/>
     <w:basedOn w:val="Normal"/>
     <w:uiPriority w:val="34"/>

</xml_diff>